<commit_message>
Humanise the prose of the Habaswein teacher preparedness proposal
Rewrite Chapters One to Three and the abstract in plainer, more natural
academic English: vary sentence length, drop formulaic signposting, and
break up long stacked sentences. Citations, objectives, hypotheses, tables
and structure are unchanged.

Co-Authored-By: Claude Opus 5.5 <noreply@anthropic.com>
Claude-Session: https://claude.ai/code/session_0156y3peV5itsnvHYwbnPUqo
</commit_message>
<xml_diff>
--- a/Research_Proposal_Teacher_Preparedness_CBC_Habaswein.docx
+++ b/Research_Proposal_Teacher_Preparedness_CBC_Habaswein.docx
@@ -566,7 +566,7 @@
         <w:t xml:space="preserve">1.8 Significance of the Study</w:t>
       </w:r>
       <w:r>
-        <w:t xml:space="preserve">	6</w:t>
+        <w:t xml:space="preserve">	5</w:t>
       </w:r>
     </w:p>
     <w:p>
@@ -623,7 +623,7 @@
         <w:t xml:space="preserve">1.11 Assumptions of the Study</w:t>
       </w:r>
       <w:r>
-        <w:t xml:space="preserve">	7</w:t>
+        <w:t xml:space="preserve">	6</w:t>
       </w:r>
     </w:p>
     <w:p>
@@ -737,7 +737,7 @@
         <w:t xml:space="preserve">2.2.3 Pedagogical Skills and Implementation of the Competency-Based Curriculum</w:t>
       </w:r>
       <w:r>
-        <w:t xml:space="preserve">	10</w:t>
+        <w:t xml:space="preserve">	9</w:t>
       </w:r>
     </w:p>
     <w:p>
@@ -870,7 +870,7 @@
         <w:t xml:space="preserve">2.6 Conceptual Framework</w:t>
       </w:r>
       <w:r>
-        <w:t xml:space="preserve">	14</w:t>
+        <w:t xml:space="preserve">	13</w:t>
       </w:r>
     </w:p>
     <w:p>
@@ -1542,7 +1542,7 @@
         <w:t xml:space="preserve">Table 2.1: Summary of Research Gaps</w:t>
       </w:r>
       <w:r>
-        <w:t xml:space="preserve">	12</w:t>
+        <w:t xml:space="preserve">	11</w:t>
       </w:r>
     </w:p>
     <w:p>
@@ -3542,7 +3542,7 @@
         <w:jc w:val="both"/>
       </w:pPr>
       <w:r>
-        <w:t xml:space="preserve">Kenya replaced the 8-4-4 system with the Competency-Based Curriculum (CBC) so that learners would leave school able to think critically, solve problems and apply what they learn. Whether this happens depends largely on how well teachers have been prepared to deliver the new curriculum. Studies from several Kenyan counties show that many teachers received only brief cascade training, hold mixed attitudes towards the reform and find learner-centred teaching and competency-based assessment difficult. These problems are likely to be greater in remote, arid and insecure areas, yet most of the evidence comes from Nairobi, central and western Kenya. The purpose of this study is to establish the influence of teacher preparedness on the implementation of the CBC in public primary schools in Habaswein Sub-County, Wajir County. The objectives are to determine the influence of in-service training, assess the influence of teachers’ attitude, establish the influence of pedagogical skills and examine the influence of competency-based assessment skills on CBC implementation. The study is anchored on the Concerns-Based Adoption Model and Shulman’s theory of Pedagogical Content Knowledge. It will adopt a mixed methods approach within a descriptive survey design. The target population is 368 teachers and 46 head teachers in 46 public primary schools. A sample of 192 teachers will be selected using Yamane’s formula and proportionate stratified random sampling, and 14 head teachers will be selected purposively. Data will be collected using a teacher questionnaire, a head teacher interview guide, a classroom observation checklist and a document analysis guide, all piloted in Wajir South Sub-County. Quantitative data will be analysed in SPSS using descriptive statistics, Pearson’s correlation and simple and multiple linear regression, while qualitative data will be analysed thematically. The findings are expected to help the Ministry of Education, the Teachers Service Commission, teacher training institutions and head teachers to prepare and support teachers in marginalised areas more effectively.</w:t>
+        <w:t xml:space="preserve">Kenya replaced the 8-4-4 system with the Competency-Based Curriculum (CBC) so that learners would leave school able to think critically, solve problems and use what they have learnt. Whether this happens depends a great deal on how well teachers have been prepared for the new curriculum. Studies from several counties show that many teachers had only short cascade training, have mixed feelings about the reform, and find learner-centred teaching and competency-based assessment hard. These problems are probably worse in remote, arid and insecure areas, but most of the research so far comes from Nairobi, central and western Kenya. The purpose of this study is to establish the influence of teacher preparedness on the implementation of the CBC in public primary schools in Habaswein Sub-County, Wajir County. The objectives are to determine the influence of in-service training, assess the influence of teachers’ attitude, establish the influence of pedagogical skills and examine the influence of competency-based assessment skills on CBC implementation. The study is anchored on the Concerns-Based Adoption Model and Shulman’s theory of Pedagogical Content Knowledge. It will adopt a mixed methods approach within a descriptive survey design. The target population is 368 teachers and 46 head teachers in 46 public primary schools. A sample of 192 teachers will be selected using Yamane’s formula and proportionate stratified random sampling, and 14 head teachers will be selected purposively. Data will be collected using a teacher questionnaire, a head teacher interview guide, a classroom observation checklist and a document analysis guide, all piloted in Wajir South Sub-County. Quantitative data will be analysed in SPSS using descriptive statistics, Pearson’s correlation and simple and multiple linear regression, while qualitative data will be analysed thematically. It is hoped that the findings will help the Ministry of Education, the Teachers Service Commission, teacher training institutions and head teachers to prepare and support teachers in marginalised areas better.</w:t>
       </w:r>
     </w:p>
     <w:p>
@@ -3605,7 +3605,7 @@
         <w:jc w:val="both"/>
       </w:pPr>
       <w:r>
-        <w:t xml:space="preserve">Around the world, education systems are moving away from curricula that reward the memorisation of content and towards curricula built around competencies, meaning what learners can actually do with the knowledge, skills and values they acquire. The shift has been driven by a concern that many young people leave school with good grades but struggle to solve real problems, work with others or keep learning on their own. Competency-based curricula try to fix this by changing what happens in the classroom: the teacher talks less and designs more activities in which learners do the thinking, and learners are assessed continuously instead of mainly through a final examination. Such a curriculum can only be as good as the teachers who deliver it. Darling-Hammond (2017), comparing teacher education in high-performing systems such as Finland, Singapore, Canada and Australia, found that what these systems share is heavy and sustained investment in preparing teachers before and during service. The Teaching and Learning International Survey (TALIS) points the same way. Teachers whose initial training covered subject content, pedagogy and supervised classroom practice reported feeling better prepared to teach, and teachers in many countries still said they needed more professional development in areas such as teaching learners with different needs and using new methods (Organisation for Economic Co-operation and Development [OECD], 2019).</w:t>
+        <w:t xml:space="preserve">Many countries have, over the last two decades, reformed their school curricula to focus on competencies, that is, what learners are able to do with the knowledge, skills and values they gain in school. The thinking behind this is simple. A lot of young people pass examinations and still find it hard to solve everyday problems, work in a team or carry on learning without a teacher. A competency-based curriculum tries to change this by changing the classroom itself. Learners are expected to do more of the work, and they are assessed as they learn rather than mostly at the end of a course. All of this rests on the teacher. Darling-Hammond (2017) compared teacher education in Finland, Singapore, Canada and Australia and found that the common factor in these strong systems was serious, long-term investment in preparing teachers, both before they start teaching and after. The Teaching and Learning International Survey (TALIS) reported something similar. Teachers whose initial training had covered content, pedagogy and practice in real classrooms said they felt better prepared, while many teachers across the participating countries still felt they needed more training in newer teaching methods and in handling learners with different needs (Organisation for Economic Co-operation and Development [OECD], 2019).</w:t>
       </w:r>
     </w:p>
     <w:p>
@@ -3614,7 +3614,7 @@
         <w:jc w:val="both"/>
       </w:pPr>
       <w:r>
-        <w:t xml:space="preserve">Preparing teachers for a new curriculum is not only a matter of giving them information. Hall and Hord (2020) show that teachers pass through predictable stages of concern when they meet an innovation, starting with worries about what it means for them personally and how they will manage it, and only later turning to its effect on learners. When teachers are pushed through these stages too quickly, a reform is adopted on paper while the old ways of teaching continue. Teacher shortages make this harder. UNESCO and the International Task Force on Teachers for Education 2030 (2024) estimate that the world will need 44 million additional teachers by 2030, about 15 million of them in sub-Saharan Africa, and warn that many new recruits enter classrooms with little training. In other words, the countries with the most ambitious reforms are often those with the least prepared teaching forces.</w:t>
+        <w:t xml:space="preserve">Getting teachers ready for a new curriculum takes more than a briefing. Hall and Hord (2020) found that teachers go through fairly predictable stages of concern when they are asked to adopt something new. At first they worry about what it means for them and how they will cope; only later do they start thinking about its effect on learners. If they are rushed, the change happens on paper and the old teaching carries on in class. Teacher shortages add to the difficulty. UNESCO and the International Task Force on Teachers for Education 2030 (2024) estimate that 44 million more teachers will be needed worldwide by 2030, about 15 million of them in sub-Saharan Africa, and note that many newly recruited teachers start work with little training. The regions attempting the biggest reforms are often the ones with the least prepared teachers.</w:t>
       </w:r>
     </w:p>
     <w:p>
@@ -3623,7 +3623,7 @@
         <w:jc w:val="both"/>
       </w:pPr>
       <w:r>
-        <w:t xml:space="preserve">The African experience bears this out. South Africa introduced outcomes-based education through Curriculum 2005, and Jansen (1998) warned early on that the reform assumed well-trained teachers and well-resourced classrooms that most schools did not have; the curriculum was later revised several times. Tanzania adopted a competence-based curriculum in 2005, yet a decade later Komba and Mwandanji (2015) reported that many teachers still lacked a clear understanding of competence-based teaching and had received little training to implement it. In Rwanda, which introduced a competence-based curriculum in 2015, Nsengimana et al. (2023) found that eight years on many science teachers only partly understood what a competence is, and several still taught in a teacher-centred way. In Uganda, Kidega et al. (2024) reported that teachers in Gulu City, faced with classes of about 66 learners, poor facilities and very little training, often fell back on lecturing. Across the region, therefore, curriculum change has tended to move faster than the preparation of the teachers expected to carry it out.</w:t>
+        <w:t xml:space="preserve">African countries that have tried competency-based reforms have run into this problem. When South Africa launched outcomes-based education through Curriculum 2005, Jansen (1998) argued that the reform took for granted trained teachers and equipped classrooms that most schools simply did not have. The curriculum was revised more than once afterwards. Tanzania brought in a competence-based curriculum in 2005. Ten years later, Komba and Mwandanji (2015) found that many teachers were still not clear about competence-based teaching and had been given little training in it. Rwanda changed to a competence-based curriculum in 2015, and Nsengimana et al. (2023) found that science teachers there still only partly understood what a competence is, with some still teaching in the old teacher-centred way. In Gulu City, Uganda, Kidega et al. (2024) reported that teachers with classes of around 66 learners, poor facilities and very little training often went back to lecturing. In each case the curriculum changed faster than the teachers could be prepared for it.</w:t>
       </w:r>
     </w:p>
     <w:p>
@@ -3632,7 +3632,7 @@
         <w:jc w:val="both"/>
       </w:pPr>
       <w:r>
-        <w:t xml:space="preserve">Kenya began its own reform in 2017, when the Kenya Institute of Curriculum Development (KICD) introduced the Competency-Based Curriculum (CBC) under the Basic Education Curriculum Framework (KICD, 2017). Sessional Paper No. 1 of 2019 anchored the reform in policy (Ministry of Education [MoE], 2019). The curriculum seeks to develop seven core competencies, among them communication and collaboration, critical thinking and problem solving, creativity and imagination, and digital literacy. The first CBC cohort sat the Kenya Primary School Education Assessment (KPSEA) in 2022, and in 2023 the Presidential Working Party on Education Reform (PWPER) recommended that the reform continue with fewer learning areas and a retooling programme for teachers trained before the CBC (PWPER, 2023). The Ministry has since renamed it Competency-Based Education (CBE), though what is expected of teachers has not changed.</w:t>
+        <w:t xml:space="preserve">Kenya started its reform in 2017, when the Kenya Institute of Curriculum Development (KICD) introduced the Competency-Based Curriculum (CBC) under the Basic Education Curriculum Framework (KICD, 2017). Sessional Paper No. 1 of 2019 then gave the reform a policy basis (Ministry of Education [MoE], 2019). The CBC aims to build seven core competencies, among them communication and collaboration, critical thinking and problem solving, creativity and imagination, and digital literacy. The first CBC learners sat the Kenya Primary School Education Assessment (KPSEA) in 2022. In 2023 the Presidential Working Party on Education Reform (PWPER) recommended that the reform go on, but with fewer learning areas and with retooling for teachers who had trained under the old system (PWPER, 2023). The Ministry now uses the name Competency-Based Education (CBE). The demands on teachers are the same as before.</w:t>
       </w:r>
     </w:p>
     <w:p>
@@ -3641,7 +3641,7 @@
         <w:jc w:val="both"/>
       </w:pPr>
       <w:r>
-        <w:t xml:space="preserve">Those expectations are demanding. A CBC teacher must plan lessons around specific learning outcomes and key inquiry questions, integrate values and pertinent and contemporary issues, use learner-centred methods and assess learners through observation, projects, portfolios and other school-based tools (Mwang’ombe, 2021). Kenyan studies suggest that many teachers were not adequately prepared for these demands. Akala (2021) describes the early rollout as hurried and poorly resourced. Momanyi and Rop (2019) found that early grade teachers in Bomet East had only a vague idea of what the CBC required, while Karua et al. (2025) found that teachers in Kinangop had become more aware of CBC principles but had not adjusted their teaching to match. Training has largely taken the form of short cascade workshops, and Kailo and Njagi (2025) found that the quality of training resources significantly influenced how well teachers in Kilifi implemented the curriculum. Cheruiyot (2024) reported that many teachers remained unsure how to carry out competency-based assessment. Keter and Wabuke (2025) found a positive relationship between teacher preparedness and CBC implementation in Bomet County, and an evaluation by the African Population and Health Research Center (APHRC, 2022) found that genuinely learner-centred lessons were still the exception rather than the rule.</w:t>
+        <w:t xml:space="preserve">Those demands are heavy. A CBC teacher is expected to plan lessons around specific learning outcomes and key inquiry questions, bring values and pertinent and contemporary issues into lessons, use learner-centred methods, and assess learners through observation, projects, portfolios and other school-based tools (Mwang’ombe, 2021). Several Kenyan studies suggest that teachers were not well prepared for this. Akala (2021) describes the early rollout as rushed and short of resources. Momanyi and Rop (2019) found that early grade teachers in Bomet East had only a vague idea of what the CBC required of them. Karua et al. (2025) noted that teachers in Kinangop now knew more about CBC principles, but their teaching had not changed much. Most teachers were trained through short cascade workshops, and in Kilifi, Kailo and Njagi (2025) found that the quality of training resources had a significant effect on how well teachers implemented the curriculum. Cheruiyot (2024) reported that many teachers were still unsure how to do competency-based assessment. In Bomet, Keter and Wabuke (2025) found a positive relationship between teacher preparedness and CBC implementation. An evaluation by the African Population and Health Research Center (APHRC, 2022) also found that properly learner-centred lessons were still uncommon.</w:t>
       </w:r>
     </w:p>
     <w:p>
@@ -3650,7 +3650,7 @@
         <w:jc w:val="both"/>
       </w:pPr>
       <w:r>
-        <w:t xml:space="preserve">If teachers in fairly well-served counties are finding the CBC hard, the arid north-east deserves particular attention. Wajir County is part of Kenya’s Arid and Semi-Arid Lands, where long distances, recurrent drought and pastoral mobility have kept education indicators below the national average for many years. Habaswein Sub-County, in the south-west of the county, had about 174,000 residents at the 2019 census (Kenya National Bureau of Statistics [KNBS], 2019). Its schools serve both settled and pastoralist families spread over a wide area. Since 2023, insecurity linked to al-Shabaab has led many non-local teachers to seek transfers out of Wajir, Mandera and Garissa, and the Teachers Service Commission (TSC) has had to hire contract teachers to fill the gaps (“How TSC Beat Teachers Crisis,” 2024). Many of these replacements are newly qualified and have had little or no CBC training. Writing about northern Kenya, Hussein (2023) observed that CBC implementation in the region was held back by poor training, few resources and difficulty in adapting to the new teaching methods. Despite these warning signs, there is little local evidence on how prepared teachers in Habaswein are for the CBC and how their preparedness affects the way the curriculum is implemented. This study seeks to provide that evidence.</w:t>
+        <w:t xml:space="preserve">If teachers in fairly well-served counties are struggling, there is good reason to worry about the arid north-east. Wajir County falls within Kenya’s Arid and Semi-Arid Lands, where long distances, frequent droughts and the movement of pastoralist families have kept education indicators below the national average for a long time. Habaswein Sub-County lies in the south-west of the county and had about 174,000 people at the 2019 census (Kenya National Bureau of Statistics [KNBS], 2019). Its schools serve settled families as well as pastoralists living in scattered settlements. Since 2023, insecurity linked to al-Shabaab has pushed many non-local teachers to ask for transfers out of Wajir, Mandera and Garissa, and the Teachers Service Commission (TSC) has hired contract teachers to fill the vacancies (“How TSC Beat Teachers Crisis,” 2024). Many of these teachers are newly qualified and have had little or no CBC training. Hussein (2023) observed that in northern Kenya, CBC implementation was held back by weak training, few resources and difficulty with the new teaching methods. Even so, there is very little local data on how prepared Habaswein teachers are for the CBC, or on how their preparedness shapes what happens in the classroom.</w:t>
       </w:r>
     </w:p>
     <w:p>
@@ -3669,7 +3669,7 @@
         <w:jc w:val="both"/>
       </w:pPr>
       <w:r>
-        <w:t xml:space="preserve">By now, every public primary school in Kenya is expected to have teachers who have been trained in the CBC, who accept and believe in the reform, who plan and teach learner-centred lessons and who assess learners continuously. If this were the case, learners would complete Grade 6 having acquired the competencies the curriculum promises, as both the Basic Education Curriculum Framework (KICD, 2017) and the PWPER (2023) report assume. Almost ten years into the rollout, however, studies from several counties show that many teachers received only brief cascade training, remain unsure of what the CBC requires, find competency-based assessment confusing and continue to teach in the old teacher-centred way (Cheruiyot, 2024; Kailo &amp; Njagi, 2025; Karua et al., 2025; Mutua &amp; Waweru, 2023).</w:t>
+        <w:t xml:space="preserve">Ideally, every public primary school in Kenya should by now have teachers who have been trained in the CBC, who support it, who can plan and teach learner-centred lessons, and who assess learners continuously. Learners taught by such teachers would complete Grade 6 with the competencies the curriculum promises. This is what the Basic Education Curriculum Framework (KICD, 2017) and the PWPER (2023) report expect. The reality, nearly ten years after the rollout began, is different. Studies in several counties have found that many teachers had only short cascade training, are still unsure of what the CBC requires, find competency-based assessment confusing and keep teaching in a teacher-centred way (Cheruiyot, 2024; Kailo &amp; Njagi, 2025; Karua et al., 2025; Mutua &amp; Waweru, 2023).</w:t>
       </w:r>
     </w:p>
     <w:p>
@@ -3678,7 +3678,7 @@
         <w:jc w:val="both"/>
       </w:pPr>
       <w:r>
-        <w:t xml:space="preserve">The situation is likely to be worse in Habaswein Sub-County. Teachers there work in remote schools with few instructional materials, carry heavy workloads and seldom have chances for professional development. After many non-local teachers left in 2023, a number of schools came to depend on newly recruited or contract teachers, many of whom may never have attended CBC training (“How TSC Beat Teachers Crisis,” 2024). Where teachers are poorly prepared, learners miss the practical, skills-based learning the curriculum was designed to provide, and the gap between marginalised and better-served regions is likely to widen. Yet almost all research on teacher preparedness and the CBC has been carried out in Nairobi, Machakos, Bomet, Nyandarua, Kilifi and western Kenya. Little is known about how well teachers in Habaswein have been prepared in terms of training, attitude, pedagogical skills and assessment skills, or how each of these influences CBC implementation (APHRC, 2022; Hussein, 2023). Without such evidence, efforts to support teachers in the sub-county are likely to remain general and poorly targeted. It is against this background that this study seeks to establish the influence of teacher preparedness on the implementation of the CBC in public primary schools in Habaswein Sub-County.</w:t>
+        <w:t xml:space="preserve">In Habaswein Sub-County the situation is probably worse. Schools are remote, instructional materials are scarce, workloads are heavy and teachers rarely get chances for professional development. When many non-local teachers left in 2023, some schools were left relying on newly recruited or contract teachers, some of whom may never have attended any CBC training (“How TSC Beat Teachers Crisis,” 2024). Poorly prepared teachers mean that learners miss the practical, skills-based learning the CBC was meant to deliver, and the gap between marginalised regions and the rest of the country could widen. Most research on teacher preparedness and the CBC, however, has been done in Nairobi, Machakos, Bomet, Nyandarua, Kilifi and western Kenya. We know little about how well Habaswein teachers have been prepared in terms of training, attitude, pedagogical skills and assessment skills, or about how each of these affects CBC implementation (APHRC, 2022; Hussein, 2023). Without this information, support for teachers in the sub-county is likely to stay general and poorly targeted. This study therefore seeks to establish the influence of teacher preparedness on the implementation of the CBC in public primary schools in Habaswein Sub-County.</w:t>
       </w:r>
     </w:p>
     <w:p>
@@ -3956,7 +3956,7 @@
         <w:jc w:val="both"/>
       </w:pPr>
       <w:r>
-        <w:t xml:space="preserve">There are three main reasons why this study is needed now. First, the first CBC cohorts have already moved into junior school, and the PWPER (2023) has called for teachers to be retooled. Planning that retooling requires knowing which aspects of preparedness are weakest and which matter most for implementation, particularly in regions that national samples tend to leave out. Secondly, since 2023 the north-east has experienced unusual staffing upheaval, as experienced non-local teachers left and were replaced by new or contract teachers (“How TSC Beat Teachers Crisis,” 2024). This has most likely changed the preparedness profile of the teaching force in ways that earlier studies did not capture. Thirdly, the few studies done in northern Kenya (Hussein, 2023) are small and mainly descriptive, and none has statistically tested how different dimensions of teacher preparedness influence implementation in Habaswein. A focused study will help close this gap and give policy makers more specific guidance than general remarks about “challenges in marginalised areas”.</w:t>
+        <w:t xml:space="preserve">This study is timely for three reasons. To begin with, the first CBC learners are already in junior school and the PWPER (2023) has called for teachers to be retooled. Retooling can only be planned well if we know which parts of teacher preparedness are weakest and which have the most effect on implementation, especially in areas that national studies usually leave out. Secondly, the north-east has gone through an unusual staffing upheaval since 2023. Experienced non-local teachers left and new or contract teachers took their places (“How TSC Beat Teachers Crisis,” 2024), and this has probably changed how prepared the teaching force is in ways earlier studies could not have picked up. Thirdly, the little research done in northern Kenya (Hussein, 2023) is small in scale and mostly descriptive. No study has tested statistically how the different dimensions of teacher preparedness influence implementation in Habaswein. This study will help fill that gap and give policy makers something more specific to work with than broad statements about “challenges in marginalised areas”.</w:t>
       </w:r>
     </w:p>
     <w:p>
@@ -3976,7 +3976,7 @@
         <w:jc w:val="both"/>
       </w:pPr>
       <w:r>
-        <w:t xml:space="preserve">The findings are expected to be useful to several groups:</w:t>
+        <w:t xml:space="preserve">The findings should be of use to the following groups:</w:t>
       </w:r>
     </w:p>
     <w:p>
@@ -3990,7 +3990,7 @@
         <w:jc w:val="both"/>
       </w:pPr>
       <w:r>
-        <w:t xml:space="preserve">The Ministry of Education and the TSC could use them to design retooling and in-service programmes for teachers in arid and remote areas, and to plan staffing and hardship incentives.</w:t>
+        <w:t xml:space="preserve">The Ministry of Education and the TSC, when designing retooling and in-service programmes for teachers in arid and remote areas and when planning staffing and hardship incentives.</w:t>
       </w:r>
     </w:p>
     <w:p>
@@ -4004,7 +4004,7 @@
         <w:jc w:val="both"/>
       </w:pPr>
       <w:r>
-        <w:t xml:space="preserve">The Kenya Institute of Curriculum Development may use the results to revise training content and curriculum support materials so that they suit low-resource schools.</w:t>
+        <w:t xml:space="preserve">The Kenya Institute of Curriculum Development, when revising training content and support materials so that they work in low-resource schools.</w:t>
       </w:r>
     </w:p>
     <w:p>
@@ -4018,7 +4018,7 @@
         <w:jc w:val="both"/>
       </w:pPr>
       <w:r>
-        <w:t xml:space="preserve">Teacher training institutions may use the findings to strengthen pre-service and in-service courses, especially in learner-centred teaching and competency-based assessment.</w:t>
+        <w:t xml:space="preserve">Teacher training institutions, which may use them to improve pre-service and in-service courses, particularly on learner-centred teaching and competency-based assessment.</w:t>
       </w:r>
     </w:p>
     <w:p>
@@ -4032,7 +4032,7 @@
         <w:jc w:val="both"/>
       </w:pPr>
       <w:r>
-        <w:t xml:space="preserve">Head teachers and Boards of Management may use them to plan school-based professional development, peer support and instructional supervision.</w:t>
+        <w:t xml:space="preserve">Head teachers and Boards of Management, when planning school-based professional development, peer support and instructional supervision.</w:t>
       </w:r>
     </w:p>
     <w:p>
@@ -4046,7 +4046,7 @@
         <w:jc w:val="both"/>
       </w:pPr>
       <w:r>
-        <w:t xml:space="preserve">Teachers will gain a clearer picture of their own preparedness and of the kinds of support that make a difference.</w:t>
+        <w:t xml:space="preserve">Teachers themselves, who will get a clearer picture of how prepared they are and what kind of support actually helps.</w:t>
       </w:r>
     </w:p>
     <w:p>
@@ -4060,7 +4060,7 @@
         <w:jc w:val="both"/>
       </w:pPr>
       <w:r>
-        <w:t xml:space="preserve">Researchers will have evidence from a region that is seldom studied, and a basis for further work on curriculum reform in marginalised settings.</w:t>
+        <w:t xml:space="preserve">Researchers, who will have data from a region that is rarely studied and a starting point for further work on curriculum reform in marginalised areas.</w:t>
       </w:r>
     </w:p>
     <w:p>
@@ -4079,7 +4079,7 @@
         <w:jc w:val="both"/>
       </w:pPr>
       <w:r>
-        <w:t xml:space="preserve">Some teachers may be reluctant to admit gaps in their preparedness for fear that the information could be used against them. To reduce this risk, the questionnaire will be anonymous, respondents will be assured that the study has nothing to do with TSC appraisal, and what teachers report will be checked against classroom observation and school documents. Reaching remote schools may be difficult because the sub-county is large, roads are poor and some areas are insecure. The researcher will plan travel with the Sub-County Director of Education and the local administration and will schedule visits in the dry season. Pastoralist movement may lower learner attendance on some observation days; where a class is too small to reflect normal teaching, the observation will be rescheduled.</w:t>
+        <w:t xml:space="preserve">Some teachers may not want to admit weaknesses in their preparation in case the information is used against them. To reduce this, the questionnaire will not ask for names, respondents will be told that the study has no link to TSC appraisal, and teachers’ answers will be compared with what is seen in classroom observation and school records. Getting to remote schools may be hard because the sub-county is large, roads are poor and some places are insecure. The researcher will plan travel with the Sub-County Director of Education and the local administration and will visit during the dry season. On some days, pastoralist movement may reduce the number of learners in class. If a class is too small to show normal teaching, the observation will be moved to another day.</w:t>
       </w:r>
     </w:p>
     <w:p>
@@ -4098,7 +4098,7 @@
         <w:jc w:val="both"/>
       </w:pPr>
       <w:r>
-        <w:t xml:space="preserve">The study will cover only public primary schools in Habaswein Sub-County, Wajir County. Private schools, pre-primary centres and junior schools are excluded because they are staffed and managed differently. Respondents will be teachers of Grades 1 to 6 and head teachers. Teacher preparedness will be limited to four dimensions, namely in-service training, attitude towards the CBC, pedagogical skills and competency-based assessment skills, and implementation will be measured using classroom-level indicators. Data will be collected between March and April 2027.</w:t>
+        <w:t xml:space="preserve">The study is limited to public primary schools in Habaswein Sub-County, Wajir County. Private schools, pre-primary centres and junior schools are left out because they are staffed and run differently. The respondents will be teachers of Grades 1 to 6 and head teachers. Teacher preparedness will be looked at under four dimensions only: in-service training, attitude towards the CBC, pedagogical skills and competency-based assessment skills. Implementation will be measured using classroom-level indicators. Data will be collected in March and April 2027.</w:t>
       </w:r>
     </w:p>
     <w:p>
@@ -4117,7 +4117,7 @@
         <w:jc w:val="both"/>
       </w:pPr>
       <w:r>
-        <w:t xml:space="preserve">The study assumes that respondents will answer honestly, that records at the Sub-County Director of Education’s office accurately show the number of schools and teachers, that sampled schools will be safe and accessible during data collection, and that the lessons observed will reflect how teachers normally teach.</w:t>
+        <w:t xml:space="preserve">The study assumes that respondents will answer truthfully, that the records at the Sub-County Director of Education’s office give a correct count of schools and teachers, that the sampled schools will be safe to visit during data collection, and that the lessons observed will be typical of how the teachers normally teach.</w:t>
       </w:r>
     </w:p>
     <w:p>
@@ -4151,7 +4151,7 @@
         <w:jc w:val="both"/>
       </w:pPr>
       <w:r>
-        <w:t xml:space="preserve">This chapter reviews earlier studies on teacher preparedness and the implementation of competency-based curricula. It begins with the empirical literature, organised under the four objectives of the study, and then presents a critique of the literature and a summary of the research gaps. The theoretical framework follows, and the chapter ends with the conceptual framework that shows how the study variables are expected to relate.</w:t>
+        <w:t xml:space="preserve">This chapter looks at what other researchers have found on teacher preparedness and the implementation of competency-based curricula. The empirical studies are reviewed first, under the four objectives of the study. A critique of the literature and a summary of the research gaps come next, followed by the theoretical framework. The chapter closes with the conceptual framework, which shows how the variables are expected to relate.</w:t>
       </w:r>
     </w:p>
     <w:p>
@@ -4180,7 +4180,7 @@
         <w:jc w:val="both"/>
       </w:pPr>
       <w:r>
-        <w:t xml:space="preserve">Training is the dimension of preparedness that most studies mention first. At the international level, Darling-Hammond et al. (2017) reviewed 35 studies of professional development and concluded that training changes classroom practice when it is sustained, focused on content, built around active learning and supported by coaching, not when it is a one-off event. Guskey (2002) adds that teachers usually change their beliefs only after they have tried a new practice and seen it work with their own learners, which is why follow-up support after training matters so much. Data from TALIS show that participation in professional development is widespread in OECD countries, but that teachers value most the training that is practical and collaborative (OECD, 2019).</w:t>
+        <w:t xml:space="preserve">Most studies on teacher preparedness start with training. Darling-Hammond et al. (2017) reviewed 35 studies of professional development and found that the training which changed classroom practice was usually sustained over time, tied to subject content, active and backed by coaching. One-off workshops rarely had much effect. Guskey (2002) points out that teachers tend to change their beliefs only after they have tried a new practice and seen it work with their own learners. Follow-up support after training is therefore important. TALIS data show that most teachers in OECD countries take part in some professional development, and that the training they find most useful is practical and involves working with colleagues (OECD, 2019).</w:t>
       </w:r>
     </w:p>
     <w:p>
@@ -4189,7 +4189,7 @@
         <w:jc w:val="both"/>
       </w:pPr>
       <w:r>
-        <w:t xml:space="preserve">In Africa, inadequate training has been a recurring explanation for weak implementation. In Tanzania, Komba and Mwandanji (2015) found that many secondary school teachers had not been trained to teach under the competence-based curriculum, and that this left them unsure how to plan and teach competence-based lessons. Kidega et al. (2024) reached a similar conclusion in Gulu City, Uganda, where teachers who had received little training on the new curriculum frequently fell back on lecturing.</w:t>
+        <w:t xml:space="preserve">African studies often blame weak implementation on poor training. Komba and Mwandanji (2015) found that many Tanzanian secondary school teachers had not been trained for the competence-based curriculum and were unsure how to plan and teach competence-based lessons. Kidega et al. (2024) found much the same in Gulu City, Uganda. Teachers there who had received little training on the new curriculum often went back to lecturing.</w:t>
       </w:r>
     </w:p>
     <w:p>
@@ -4198,7 +4198,7 @@
         <w:jc w:val="both"/>
       </w:pPr>
       <w:r>
-        <w:t xml:space="preserve">In Kenya, most teachers were introduced to the CBC through short cascade workshops in which a few teachers were trained and expected to pass the training on to colleagues. Kailo and Njagi (2025) studied in-service training in public primary schools in Kilifi County and found that the quality of training resources and materials significantly influenced CBC implementation, and that many teachers considered the cascade model inadequate. Mogere (2022) found that teacher preparedness, including training, was among the strongest determinants of CBC implementation in Nairobi County. Hussein (2023), in one of the few studies from northern Kenya, reported that limited training left teachers struggling with the new learning areas, teaching strategies and assessment techniques.</w:t>
+        <w:t xml:space="preserve">In Kenya, most teachers first met the CBC through short cascade workshops, where a few teachers were trained and then expected to train the others. Kailo and Njagi (2025) looked at in-service training in public primary schools in Kilifi County. They found that the quality of training resources and materials had a significant influence on CBC implementation, and many of the teachers they spoke to felt the cascade model was not enough. In Nairobi County, Mogere (2022) found that teacher preparedness, training included, was one of the strongest determinants of CBC implementation. Hussein (2023), one of the few researchers to work in northern Kenya, reported that teachers with little training struggled with the new learning areas, teaching strategies and assessment methods.</w:t>
       </w:r>
     </w:p>
     <w:p>
@@ -4207,7 +4207,7 @@
         <w:jc w:val="both"/>
       </w:pPr>
       <w:r>
-        <w:t xml:space="preserve">These studies agree that training matters, but they mostly measure whether teachers were trained rather than how much training they received, how relevant it was and whether it was followed up. In addition, none of them was carried out in an area where a large share of teachers joined after the main CBC training cycles, as is the case in Habaswein after 2023. The present study will measure these aspects of training and test their influence on implementation.</w:t>
+        <w:t xml:space="preserve">The studies agree that training matters. Most of them, however, only record whether a teacher was trained. They say little about how much training the teacher got, how relevant it was or whether anyone followed up afterwards. None was done in an area like Habaswein, where many teachers arrived after 2023 and so missed the main rounds of CBC training. This study will measure these aspects of training and test how they affect implementation.</w:t>
       </w:r>
     </w:p>
     <w:p>
@@ -4226,7 +4226,7 @@
         <w:jc w:val="both"/>
       </w:pPr>
       <w:r>
-        <w:t xml:space="preserve">A teacher who has been trained but does not believe in a reform is unlikely to implement it fully. Fullan (2016) argues that educational change depends on teachers finding personal meaning in it; where they do not, they tend to comply on the surface while keeping their old practices. The Stages of Concern described by Hall and Hord (2020) make the same point in more detail: teachers’ early concerns about an innovation are personal and managerial, such as worries about workload, competence and time, and their attitude improves only when these concerns are addressed. TALIS data further show that teachers’ self-efficacy, that is, their confidence in their ability to teach well, is linked to the professional support they receive and to their willingness to try new methods (OECD, 2019).</w:t>
+        <w:t xml:space="preserve">Training alone does not guarantee that a teacher will put a reform into practice. If the teacher does not believe in it, implementation is likely to be half-hearted. Fullan (2016) argues that change in schools depends on teachers finding personal meaning in it. Where they do not, they go along with it on the surface and keep their old habits. Hall and Hord’s (2020) Stages of Concern say something similar. A teacher’s first concerns about an innovation are personal and practical, such as workload, time and whether they can manage it, and attitudes tend to improve once these concerns are dealt with. TALIS data also link teachers’ self-efficacy, or confidence in their own teaching, to the support they receive and to their readiness to try new methods (OECD, 2019).</w:t>
       </w:r>
     </w:p>
     <w:p>
@@ -4235,7 +4235,7 @@
         <w:jc w:val="both"/>
       </w:pPr>
       <w:r>
-        <w:t xml:space="preserve">In Kenya, attitudes towards the CBC have been mixed. Akala (2021) records that teachers’ unions and parents raised concerns about the pace of the rollout and the workload it created, which suggests that many teachers met the reform with anxiety rather than enthusiasm. On the other hand, Murithi and Yoo (2021), in a survey of 351 primary school teachers, found that teachers were generally positive about using ICT to implement the CBC, but poor facilities and limited technical skills meant that positive attitudes did not always translate into practice. Mutua and Waweru (2023) included attitude as part of teacher competence in Machakos County and found that competence, defined as knowledge, skills and attitudes, was associated with the level of CBC implementation.</w:t>
+        <w:t xml:space="preserve">Kenyan teachers’ attitudes towards the CBC appear to be mixed. Akala (2021) notes that teachers’ unions and parents complained about how fast the curriculum was rolled out and about the extra work it brought. Many teachers seem to have met the reform with some anxiety. Murithi and Yoo (2021) surveyed 351 primary school teachers and found that most were positive about using ICT in the CBC. Poor facilities and weak technical skills, though, meant that this positive attitude often did not show in their teaching. In Machakos County, Mutua and Waweru (2023) treated attitude as one part of teacher competence, together with knowledge and skills, and found that competence was associated with the level of CBC implementation.</w:t>
       </w:r>
     </w:p>
     <w:p>
@@ -4244,7 +4244,7 @@
         <w:jc w:val="both"/>
       </w:pPr>
       <w:r>
-        <w:t xml:space="preserve">Attitude, however, is usually folded into broader measures of competence or preparedness, and its separate influence on implementation has rarely been tested. It is also likely to be shaped by local conditions such as insecurity, isolation and heavy workloads, which are pronounced in Habaswein but absent from the settings studied so far. This study will measure teachers’ attitude towards the CBC as a distinct dimension of preparedness.</w:t>
+        <w:t xml:space="preserve">In most of these studies attitude is combined with other measures, so its own effect on implementation is seldom tested. Attitude is also likely to depend on local conditions. Insecurity, isolation and heavy workloads are common in Habaswein but did not feature in the areas studied so far. This study will measure teachers’ attitude towards the CBC as a separate dimension of preparedness.</w:t>
       </w:r>
     </w:p>
     <w:p>
@@ -4263,7 +4263,7 @@
         <w:jc w:val="both"/>
       </w:pPr>
       <w:r>
-        <w:t xml:space="preserve">It is in pedagogy that preparedness either becomes practice or fails to. In Rwanda, Nsengimana et al. (2023) interviewed science teachers eight years after the competence-based curriculum was introduced and found that, although they could state the aims of the reform, several still relied on teacher-centred methods. In Uganda, Kidega et al. (2024) found that large classes and limited training pushed teachers back to lecturing even when they understood that learner-centred methods were expected.</w:t>
+        <w:t xml:space="preserve">Pedagogical skills are where training and attitude are tested in the classroom. Nsengimana et al. (2023) interviewed Rwandan science teachers eight years after the competence-based curriculum was introduced. The teachers could explain the aims of the reform, yet several still taught in a teacher-centred way. In Uganda, Kidega et al. (2024) found that large classes and limited training pushed teachers back to lecturing, even though they knew learner-centred methods were expected.</w:t>
       </w:r>
     </w:p>
     <w:p>
@@ -4272,7 +4272,7 @@
         <w:jc w:val="both"/>
       </w:pPr>
       <w:r>
-        <w:t xml:space="preserve">In Kenya, APHRC (2022) observed CBC lessons in several counties and found wide variation: some teachers ran lively, learner-centred lessons, while many others still depended on chalk-and-talk and whole-class repetition. What separated stronger lessons from weaker ones was less the availability of resources than the teacher’s skill in planning activities, asking open questions and involving learners. Awiti (2023) found that teachers’ skill in learner-centred approaches strongly affected CBC implementation in public primary schools in Nairobi City. Mwang’ombe (2021) observed that many teachers could list the core competencies but could not explain how to develop them in a lesson, while Karua et al. (2025) found that teachers in Kinangop were slower to change their teaching approaches than to learn CBC terminology. Murithi and Yoo (2021) added that teachers rarely used ICT in lessons despite positive attitudes, largely because of weak skills and facilities.</w:t>
+        <w:t xml:space="preserve">APHRC (2022) observed CBC lessons in several Kenyan counties and found big differences between teachers. Some lessons were lively and learner-centred. Many others still relied on chalk-and-talk and the whole class repeating after the teacher. The better lessons were not mainly the ones with more resources. They were the ones where the teacher planned good activities, asked open questions and got learners involved. Awiti (2023) found that teachers’ skill in learner-centred approaches had a strong effect on CBC implementation in public primary schools in Nairobi City. Mwang’ombe (2021) noticed that many teachers could name the core competencies but could not say how they would develop them in a lesson. In Kinangop, Karua et al. (2025) found that teachers picked up CBC terms faster than they changed the way they taught. Murithi and Yoo (2021) also reported that teachers seldom used ICT in their lessons, mostly because of weak skills and poor facilities.</w:t>
       </w:r>
     </w:p>
     <w:p>
@@ -4281,7 +4281,7 @@
         <w:jc w:val="both"/>
       </w:pPr>
       <w:r>
-        <w:t xml:space="preserve">The literature therefore suggests that pedagogical skill is where many teachers need the most help. However, most of these studies relied on questionnaires alone, and only a few compared what teachers reported with what they did in class. None was carried out in the arid north-east. This study will combine questionnaires, lesson observation and analysis of lesson plans and schemes of work to measure teachers’ pedagogical skills in Habaswein.</w:t>
+        <w:t xml:space="preserve">From these studies, pedagogical skill seems to be the area where teachers need the most help. Most of the studies, though, used questionnaires only, and few checked what teachers said against what they actually did in class. None was done in the arid north-east. This study will use questionnaires, lesson observation and a review of lesson plans and schemes of work to measure the pedagogical skills of teachers in Habaswein.</w:t>
       </w:r>
     </w:p>
     <w:p>
@@ -4300,7 +4300,7 @@
         <w:jc w:val="both"/>
       </w:pPr>
       <w:r>
-        <w:t xml:space="preserve">Assessment is central to any competency-based curriculum because learners are judged on what they can do, not only on what they can recall. In an influential review, Black and Wiliam (1998) showed that well-used formative assessment, in which teachers gather evidence of learning during instruction and use it to adjust teaching and give feedback, raises achievement substantially. Competency-based assessment depends on exactly these skills, together with the use of rubrics, observation checklists, projects and portfolios.</w:t>
+        <w:t xml:space="preserve">In a competency-based curriculum, learners are judged on what they can do as well as on what they remember, so assessment carries a lot of weight. Black and Wiliam (1998), in a widely cited review, showed that formative assessment raises achievement considerably when it is done well. This means that teachers collect evidence of learning during lessons and use it to adjust their teaching and give feedback. Competency-based assessment needs these same skills, plus the ability to use rubrics, observation checklists, projects and portfolios.</w:t>
       </w:r>
     </w:p>
     <w:p>
@@ -4309,7 +4309,7 @@
         <w:jc w:val="both"/>
       </w:pPr>
       <w:r>
-        <w:t xml:space="preserve">African studies suggest that this is one of the weakest areas of teacher preparation. Komba and Mwandanji (2015) found that Tanzanian teachers continued to rely on traditional tests because they had not been prepared to assess competencies. In Kenya, Cheruiyot (2024) found that many junior school teachers were unsure how to conduct formative and school-based assessment and kept learner portfolios mainly because they were required to, not because the portfolios informed their teaching. Awiti (2023) reported that large classes in Nairobi made it very difficult for teachers to assess learners individually, while Mwang’ombe (2021) noted that the volume of record-keeping required under the CBC was a source of frustration for many teachers.</w:t>
+        <w:t xml:space="preserve">Studies in Africa suggest that teachers are least prepared in this area. Komba and Mwandanji (2015) found that Tanzanian teachers kept using traditional tests because nobody had shown them how to assess competencies. In Kenya, Cheruiyot (2024) found that many junior school teachers were unsure how to carry out formative and school-based assessment. They kept learner portfolios because they had to, and the portfolios did little to guide their teaching. Awiti (2023) reported that in Nairobi, large classes made it very hard to assess learners one by one. Mwang’ombe (2021) noted that many teachers were frustrated by the amount of record-keeping the CBC requires.</w:t>
       </w:r>
     </w:p>
     <w:p>
@@ -4318,7 +4318,7 @@
         <w:jc w:val="both"/>
       </w:pPr>
       <w:r>
-        <w:t xml:space="preserve">Although these studies identify assessment as a problem, few have measured teachers’ competency-based assessment skills directly or tested how much they contribute to implementation. In Habaswein, high learner mobility among pastoralist families adds a further difficulty, since continuous assessment depends on regular attendance. The present study will examine how teachers’ assessment skills influence CBC implementation in this context.</w:t>
+        <w:t xml:space="preserve">These studies show that assessment is a problem. Few of them, however, measured teachers’ assessment skills directly or tested how much those skills affect implementation. Habaswein has an extra difficulty. Pastoralist families move often, and continuous assessment is hard when learners do not attend regularly. This study will examine how teachers’ assessment skills influence CBC implementation in this setting.</w:t>
       </w:r>
     </w:p>
     <w:p>
@@ -4337,7 +4337,7 @@
         <w:jc w:val="both"/>
       </w:pPr>
       <w:r>
-        <w:t xml:space="preserve">While the reviewed studies agree that teacher preparedness matters for curriculum implementation, they have four main shortcomings. The first is geographical. Most Kenyan studies were carried out in Nairobi, Machakos, Bomet, Nyandarua, Kilifi and other counties with fairly good access to training and supervision, while the north-east appears mainly in small descriptive studies such as Hussein (2023). Secondly, many studies relied on teachers’ own reports, which tend to overstate preparedness; only a few (APHRC, 2022; Keter &amp; Wabuke, 2025) combined questionnaires with classroom observation. Thirdly, several studies treated preparedness as a single variable, which makes it impossible to tell whether training, attitude, pedagogical skills or assessment skills matter most. Lastly, most of the studies were done before the post-2023 staffing disruption in the north-east and the policy changes that followed the PWPER report. The present study addresses these gaps by focusing on Habaswein, measuring four distinct dimensions of preparedness, checking self-reports against observation and documents, and accounting for insecurity and teacher turnover as intervening variables.</w:t>
+        <w:t xml:space="preserve">The studies reviewed agree that teacher preparedness affects implementation, but they have four weaknesses. The first concerns location. Most of the Kenyan studies were done in Nairobi, Machakos, Bomet, Nyandarua, Kilifi and other counties where training and supervision are fairly easy to reach. The north-east appears mostly in small descriptive studies such as Hussein (2023). Secondly, many studies relied on what teachers said about themselves, and teachers tend to overrate their own preparedness. Only a few (APHRC, 2022; Keter &amp; Wabuke, 2025) also observed lessons. Thirdly, several studies measured preparedness as one variable. It is then impossible to tell whether training, attitude, pedagogical skills or assessment skills matter most. Finally, most of the studies came before the staffing crisis in the north-east in 2023 and the policy changes that followed the PWPER report. This study tries to deal with these weaknesses. It focuses on Habaswein, measures four separate dimensions of preparedness, checks what teachers say against observation and school records, and treats insecurity and teacher turnover as intervening variables.</w:t>
       </w:r>
     </w:p>
     <w:p>
@@ -4356,7 +4356,7 @@
         <w:jc w:val="both"/>
       </w:pPr>
       <w:r>
-        <w:t xml:space="preserve">The review shows that many teachers implementing competency-based curricula received limited training, hold mixed attitudes towards the reform, and lack confidence in learner-centred teaching and competency-based assessment. Where teachers are better prepared, implementation is generally stronger. Table 2.1 summarises the main studies and the gaps they leave.</w:t>
+        <w:t xml:space="preserve">Overall, the review shows that many teachers working with competency-based curricula had little training, have mixed feelings about the reform and are not confident with learner-centred teaching or competency-based assessment. Implementation is generally better where teachers are better prepared. Table 2.1 sums up the main studies and the gaps they leave.</w:t>
       </w:r>
     </w:p>
     <w:p>
@@ -5711,7 +5711,7 @@
         <w:jc w:val="both"/>
       </w:pPr>
       <w:r>
-        <w:t xml:space="preserve">These gaps point to the need for a study that measures distinct dimensions of teacher preparedness in a marginalised and insecure area and tests how each influences CBC implementation. The present study in Habaswein Sub-County has been designed with this in mind.</w:t>
+        <w:t xml:space="preserve">What is missing is a study that measures the separate dimensions of teacher preparedness in a marginalised and insecure area and tests how each one affects CBC implementation. This study in Habaswein Sub-County has been designed to do that.</w:t>
       </w:r>
     </w:p>
     <w:p>
@@ -5730,7 +5730,7 @@
         <w:jc w:val="both"/>
       </w:pPr>
       <w:r>
-        <w:t xml:space="preserve">The study is anchored on two theories: the Concerns-Based Adoption Model and Shulman’s theory of Pedagogical Content Knowledge.</w:t>
+        <w:t xml:space="preserve">Two theories guide this study: the Concerns-Based Adoption Model and Shulman’s theory of Pedagogical Content Knowledge.</w:t>
       </w:r>
     </w:p>
     <w:p>
@@ -5749,7 +5749,7 @@
         <w:jc w:val="both"/>
       </w:pPr>
       <w:r>
-        <w:t xml:space="preserve">The Concerns-Based Adoption Model (CBAM) was developed at the University of Texas in the 1970s and is explained in detail by Hall and Hord (2020). It rests on the idea that change is a process rather than an event, and that individuals change before institutions do. The model has three diagnostic dimensions. The Stages of Concern trace how a teacher’s feelings about an innovation develop, from wanting basic information, through personal concerns (“What does this mean for me?”) and management concerns (“Where will I find the time and materials?”), to concern for the effect on learners and for working with colleagues to improve it. The Levels of Use describe what teachers actually do, from non-use and mechanical use to routine and refined use. Innovation Configurations describe the different forms an innovation takes once it reaches classrooms.</w:t>
+        <w:t xml:space="preserve">The Concerns-Based Adoption Model (CBAM) was developed at the University of Texas in the 1970s. Hall and Hord (2020) give a full account of it. The model starts from the idea that change is a process that takes time, and that individual people have to change before an institution can. It has three parts. The Stages of Concern describe how a teacher’s feelings about an innovation develop. At first the teacher just wants information. Personal concerns follow (“What does this mean for me?”), then management concerns (“Where will I find the time and materials?”), and only later concern for learners and for working with colleagues to make it better. The Levels of Use describe what teachers actually do with the innovation, from not using it at all, to using it mechanically, to using it routinely and refining it. Innovation Configurations describe the different shapes an innovation takes once it gets into real classrooms.</w:t>
       </w:r>
     </w:p>
     <w:p>
@@ -5758,7 +5758,7 @@
         <w:jc w:val="both"/>
       </w:pPr>
       <w:r>
-        <w:t xml:space="preserve">CBAM is relevant because the CBC is an innovation that teachers in Habaswein have adopted to different degrees. The model links directly to two of the study’s objectives. First, it explains why in-service training (Objective 1) matters: training and follow-up support are the interventions that move teachers from early, self-focused concerns towards confident use. Secondly, the Stages of Concern describe the affective side of preparedness, which this study measures as teachers’ attitude towards the CBC (Objective 2). A teacher who remains anxious about workload or competence is likely to stay at a mechanical level of use. The Levels of Use also offer a way to think about the dependent variable, since effective implementation corresponds to routine or refined use of the curriculum. A limitation of CBAM is that it focuses on the individual teacher and pays less attention to structural conditions such as resources, policy changes and insecurity (Hall &amp; Hord, 2020). This study addresses that limitation by treating these conditions as intervening variables.</w:t>
+        <w:t xml:space="preserve">CBAM fits this study because the CBC is an innovation that Habaswein teachers have taken up to different degrees. It relates most closely to the first two objectives. It helps explain why in-service training (Objective 1) matters, since training and follow-up support are what move teachers past their early, self-focused worries towards confident use. The Stages of Concern also deal with how teachers feel about the CBC, which this study measures as attitude (Objective 2). A teacher who is still anxious about workload or about coping is likely to remain at the mechanical level of use. The Levels of Use are useful for thinking about the dependent variable as well, because good implementation is close to what the model calls routine or refined use. One weakness of CBAM is that it looks mainly at the individual teacher and says less about wider conditions such as resources, policy changes and insecurity (Hall &amp; Hord, 2020). In this study those conditions are treated as intervening variables.</w:t>
       </w:r>
     </w:p>
     <w:p>
@@ -5777,7 +5777,7 @@
         <w:jc w:val="both"/>
       </w:pPr>
       <w:r>
-        <w:t xml:space="preserve">Shulman (1986) argued that good teaching requires more than knowledge of a subject and more than knowledge of general teaching methods. It depends on a particular blend of the two, which he called pedagogical content knowledge (PCK): knowing how to present a given topic so that a given group of learners can understand it, which examples and activities work, and where learners usually get confused. PCK also includes knowing how to find out what learners have understood, which is the basis of good assessment.</w:t>
+        <w:t xml:space="preserve">Shulman (1986) argued that knowing a subject well is not enough to teach it well, and neither is knowing general teaching methods. Good teaching needs a mix of the two, which he called pedagogical content knowledge (PCK). PCK is knowing how to present a particular topic so that a particular group of learners will understand it. It includes knowing which examples and activities work and where learners usually get confused. It also covers knowing how to find out what learners have understood, which is what good assessment depends on.</w:t>
       </w:r>
     </w:p>
     <w:p>
@@ -5786,7 +5786,7 @@
         <w:jc w:val="both"/>
       </w:pPr>
       <w:r>
-        <w:t xml:space="preserve">The theory supports Objectives 3 and 4. The CBC changes not only what is taught but how it is taught and assessed, so a teacher who knows a learning area well may still be unable to turn it into an inquiry activity, a project or an authentic assessment task. Pedagogical skills (Objective 3) and competency-based assessment skills (Objective 4) are, in Shulman’s terms, expressions of a teacher’s PCK in the CBC classroom: the stronger these skills, the closer the lesson is likely to be to what the curriculum designers intended. A weakness of the theory is that PCK is difficult to observe directly, and teachers tend to rate their own skills generously. For this reason the study will combine questionnaires with classroom observation and analysis of lesson plans and assessment records.</w:t>
+        <w:t xml:space="preserve">This theory relates to Objectives 3 and 4. The CBC changes how learning areas are taught and assessed as well as what is taught. A teacher may know a learning area very well and still not know how to turn it into an inquiry activity, a project or a realistic assessment task. In Shulman’s terms, pedagogical skills (Objective 3) and competency-based assessment skills (Objective 4) are the ways a teacher’s PCK shows in a CBC classroom. The better these skills, the closer a lesson is likely to come to what the curriculum designers had in mind. The theory’s weakness is that PCK is hard to see directly, and teachers usually rate their own skills too highly. The study will therefore not rely on questionnaires alone but will also observe lessons and look at lesson plans and assessment records.</w:t>
       </w:r>
     </w:p>
     <w:p>
@@ -5805,7 +5805,7 @@
         <w:jc w:val="both"/>
       </w:pPr>
       <w:r>
-        <w:t xml:space="preserve">The conceptual framework in Figure 2.1 shows the hypothesised relationship between the study variables. The independent variable is teacher preparedness, measured through four dimensions: in-service training on the CBC, teachers’ attitude towards the CBC, pedagogical skills and competency-based assessment skills. The dependent variable is the implementation of the CBC. The relationship may be affected by intervening variables that the study does not manipulate but will take into account.</w:t>
+        <w:t xml:space="preserve">Figure 2.1 shows the expected relationship between the variables. Teacher preparedness is the independent variable. It is measured through four dimensions: in-service training on the CBC, teachers’ attitude towards the CBC, pedagogical skills and competency-based assessment skills. The dependent variable is implementation of the CBC. Some intervening variables may also affect the relationship. The study will not control them but will take them into account.</w:t>
       </w:r>
     </w:p>
     <w:p>
@@ -5896,7 +5896,7 @@
         <w:t xml:space="preserve">In-service training</w:t>
       </w:r>
       <w:r>
-        <w:t xml:space="preserve"> is measured by the number of CBC trainings a teacher has attended, their duration, the relevance of their content and whether follow-up support was given. Teachers who have received more, longer and more relevant training, with follow-up, are expected to implement the CBC better.</w:t>
+        <w:t xml:space="preserve"> will be measured by how many CBC trainings a teacher has attended, how long they lasted, how relevant the content was and whether there was any follow-up support. Teachers with more training, longer training and more relevant training, followed up afterwards, are expected to implement the CBC better.</w:t>
       </w:r>
     </w:p>
     <w:p>
@@ -5912,7 +5912,7 @@
         <w:t xml:space="preserve">Teachers’ attitude</w:t>
       </w:r>
       <w:r>
-        <w:t xml:space="preserve"> is measured by how useful teachers think the CBC is, how confident they feel teaching it, how willing they are to adopt new practices and how they perceive the workload it brings. A more positive attitude is expected to lead to fuller implementation.</w:t>
+        <w:t xml:space="preserve"> will be measured by how useful teachers think the CBC is, how confident they feel teaching it, how willing they are to try new practices and how they see the workload it brings. Teachers with a more positive attitude are expected to implement the curriculum more fully.</w:t>
       </w:r>
     </w:p>
     <w:p>
@@ -5928,7 +5928,7 @@
         <w:t xml:space="preserve">Pedagogical skills</w:t>
       </w:r>
       <w:r>
-        <w:t xml:space="preserve"> are measured by the preparation of schemes of work and lesson plans based on the curriculum designs, the use of learner-centred methods, the integration of core competencies, values and pertinent and contemporary issues (PCIs), and the improvisation and use of resources, including ICT.</w:t>
+        <w:t xml:space="preserve"> will be measured by how teachers prepare schemes of work and lesson plans from the curriculum designs, how far they use learner-centred methods, whether they bring core competencies, values and pertinent and contemporary issues (PCIs) into lessons, and how they improvise and use resources, ICT included.</w:t>
       </w:r>
     </w:p>
     <w:p>
@@ -5944,7 +5944,7 @@
         <w:t xml:space="preserve">Competency-based assessment skills</w:t>
       </w:r>
       <w:r>
-        <w:t xml:space="preserve"> are measured by the use of varied formative assessment tools, the use of rubrics and checklists, the maintenance of learner portfolios and assessment records, and the feedback given to learners and parents.</w:t>
+        <w:t xml:space="preserve"> will be measured by teachers’ use of different formative assessment tools, their use of rubrics and checklists, how they keep learner portfolios and assessment records, and the feedback they give to learners and parents.</w:t>
       </w:r>
     </w:p>
     <w:p>
@@ -5960,7 +5960,7 @@
         <w:t xml:space="preserve">Implementation of the CBC</w:t>
       </w:r>
       <w:r>
-        <w:t xml:space="preserve">, the dependent variable, is indicated by learner participation in learning activities, timely coverage of the curriculum designs, completion of projects and community service learning activities, parental involvement in learning, and the proportion of learners meeting or exceeding expectations in school-based assessment.</w:t>
+        <w:t xml:space="preserve">, the dependent variable, will be measured by learner participation in learning activities, whether the curriculum designs are covered on time, whether projects and community service learning activities are completed, how involved parents are, and the proportion of learners who meet or exceed expectations in school-based assessment.</w:t>
       </w:r>
     </w:p>
     <w:p>
@@ -5976,7 +5976,7 @@
         <w:t xml:space="preserve">Intervening variables</w:t>
       </w:r>
       <w:r>
-        <w:t xml:space="preserve">, namely the availability of teaching and learning resources, class size, insecurity and teacher turnover, and government policy on the CBC, may strengthen or weaken the influence of teacher preparedness on implementation. They will be captured through the questionnaire and interviews and considered when interpreting the findings.</w:t>
+        <w:t xml:space="preserve"> are the availability of teaching and learning resources, class size, insecurity and teacher turnover, and government policy on the CBC. Any of these may strengthen or weaken the effect of preparedness on implementation. Information on them will be collected through the questionnaire and interviews and taken into account when the findings are interpreted.</w:t>
       </w:r>
     </w:p>
     <w:p>
@@ -6010,7 +6010,7 @@
         <w:jc w:val="both"/>
       </w:pPr>
       <w:r>
-        <w:t xml:space="preserve">This chapter explains how the study will be carried out. It presents the research methodology and research design, the location of the study, the target population, sampling techniques and sample size, research instruments, pilot testing, validity and reliability, data collection procedures, data analysis and ethical considerations.</w:t>
+        <w:t xml:space="preserve">This chapter sets out how the study will be done. It covers the research methodology and design, where the study will take place, the target population, how the sample will be chosen and how big it will be, the instruments, pilot testing, validity and reliability, how data will be collected and analysed, and ethical issues.</w:t>
       </w:r>
     </w:p>
     <w:p>
@@ -6029,7 +6029,7 @@
         <w:jc w:val="both"/>
       </w:pPr>
       <w:r>
-        <w:t xml:space="preserve">Research methodology refers to the overall strategy and philosophical approach that guides how a study is conducted, while research design is the specific plan for collecting and analysing data within that strategy (Kothari &amp; Garg, 2019; Saunders et al., 2019). This study will be guided by the pragmatist paradigm, which holds that the research question should determine the methods used and that numerical and narrative data can be combined to give a fuller answer than either could alone (Creswell &amp; Creswell, 2023).</w:t>
+        <w:t xml:space="preserve">Research methodology is the general strategy and philosophy behind a study. Research design is the more specific plan for collecting and analysing data within that strategy (Kothari &amp; Garg, 2019; Saunders et al., 2019). This study takes a pragmatist position. Pragmatists hold that the research question should decide which methods are used, and that combining numbers with people’s own accounts can give a fuller answer than either would alone (Creswell &amp; Creswell, 2023).</w:t>
       </w:r>
     </w:p>
     <w:p>
@@ -6038,7 +6038,7 @@
         <w:jc w:val="both"/>
       </w:pPr>
       <w:r>
-        <w:t xml:space="preserve">In line with this paradigm, the study will adopt a mixed methods approach. The quantitative strand will use a structured questionnaire to measure the four dimensions of teacher preparedness and the level of CBC implementation, and will test the four null hypotheses statistically. The qualitative strand will use head teacher interviews, classroom observation and document analysis to explain why preparedness takes the form it does and how it plays out in the classroom. Combining the two strands also allows teachers’ self-reports to be checked against observed practice, which addresses one of the main weaknesses identified in the literature.</w:t>
+        <w:t xml:space="preserve">Following from this, the study will use a mixed methods approach. On the quantitative side, a structured questionnaire will measure the four dimensions of teacher preparedness and the level of CBC implementation, and the four null hypotheses will be tested statistically. On the qualitative side, interviews with head teachers, classroom observation and document analysis will help explain why teachers are prepared the way they are and what this looks like in class. Using both also means that what teachers say about themselves can be checked against what they do, which was one of the main weaknesses noted in the literature.</w:t>
       </w:r>
     </w:p>
     <w:p>
@@ -6057,7 +6057,7 @@
         <w:jc w:val="both"/>
       </w:pPr>
       <w:r>
-        <w:t xml:space="preserve">The study will use a descriptive survey design with a convergent parallel mixed methods approach. A descriptive survey collects data from a fairly large number of respondents at one point in time and describes conditions as they are, without manipulating any variable (Creswell &amp; Creswell, 2023). It is therefore suitable for establishing teachers’ current level of preparedness and how it relates to CBC implementation. Under the convergent parallel approach, quantitative and qualitative data will be collected during the same period, analysed separately and then brought together during interpretation (Creswell &amp; Creswell, 2023). Mugenda and Mugenda (2003) observe that this design is widely used in Kenyan educational research because it provides both breadth and a close look at practice.</w:t>
+        <w:t xml:space="preserve">A descriptive survey design will be used, following a convergent parallel mixed methods approach. A descriptive survey gathers data from a fairly large group of respondents at one point in time and describes things as they are, without manipulating any variable (Creswell &amp; Creswell, 2023). This suits a study that wants to find out how prepared teachers are now and how that relates to CBC implementation. In a convergent parallel approach, the quantitative and qualitative data are collected at the same time, analysed separately and then compared when the results are interpreted (Creswell &amp; Creswell, 2023). Mugenda and Mugenda (2003) note that the design is common in Kenyan education research because it gives both a broad picture and a closer look at practice.</w:t>
       </w:r>
     </w:p>
     <w:p>
@@ -6076,7 +6076,7 @@
         <w:jc w:val="both"/>
       </w:pPr>
       <w:r>
-        <w:t xml:space="preserve">The study will be conducted in Habaswein Sub-County, Wajir County, in north-eastern Kenya. The sub-county lies in the south-western part of the county along the Garissa–Wajir road, with Habaswein town as its administrative headquarters. It had about 174,000 residents at the 2019 census (KNBS, 2019). The climate is hot and dry, and most households keep livestock, although an increasing number of families are settling around trading centres. Schools range from fairly large ones in Habaswein town to small, remote schools that serve pastoralist communities.</w:t>
+        <w:t xml:space="preserve">The study will take place in Habaswein Sub-County, Wajir County, in north-eastern Kenya. The sub-county is in the south-west of the county on the Garissa–Wajir road, and Habaswein town is its headquarters. It had about 174,000 residents at the 2019 census (KNBS, 2019). The area is hot and dry. Most households keep livestock, though more families are now settling around trading centres. Some schools in Habaswein town are fairly large, while others are small and remote and serve pastoralist communities.</w:t>
       </w:r>
     </w:p>
     <w:p>
@@ -6085,7 +6085,7 @@
         <w:jc w:val="both"/>
       </w:pPr>
       <w:r>
-        <w:t xml:space="preserve">Habaswein was chosen for three reasons. It is typical of the marginalised settings rarely included in CBC research; it was directly affected by the departure of non-local teachers after 2023 (“How TSC Beat Teachers Crisis,” 2024), which makes the question of teacher preparedness urgent; and the researcher knows the area and its schools well, which will ease access and help in interpreting the findings.</w:t>
+        <w:t xml:space="preserve">There were three reasons for choosing Habaswein. It is a good example of the marginalised areas that CBC research seldom covers. It was hit directly when non-local teachers left after 2023 (“How TSC Beat Teachers Crisis,” 2024), so the question of how prepared its teachers are is pressing. And the researcher knows the area and its schools well, which will make access easier and help with making sense of the findings.</w:t>
       </w:r>
     </w:p>
     <w:p>
@@ -6104,7 +6104,7 @@
         <w:jc w:val="both"/>
       </w:pPr>
       <w:r>
-        <w:t xml:space="preserve">The target population is all teachers and head teachers in public primary schools in Habaswein Sub-County. Working figures show about 46 public primary schools with roughly 368 teachers and 46 head teachers; these figures will be confirmed with the Office of the Sub-County Director of Education before sampling. The schools are grouped into three strata that reflect the main settings in the sub-county, as shown in Table 3.1.</w:t>
+        <w:t xml:space="preserve">The target population is all teachers and head teachers in public primary schools in Habaswein Sub-County. Current working figures are about 46 public primary schools, with around 368 teachers and 46 head teachers. The researcher will confirm these numbers with the Office of the Sub-County Director of Education before sampling. The schools are put into three strata based on the main types of setting in the sub-county (Table 3.1).</w:t>
       </w:r>
     </w:p>
     <w:p>
@@ -6866,7 +6866,7 @@
         <w:jc w:val="both"/>
       </w:pPr>
       <w:r>
-        <w:t xml:space="preserve">Teachers will be selected by proportionate stratified random sampling. Stratification ensures that teachers in town, rural and remote schools are represented in proportion to their numbers, which is important because working conditions differ widely across these settings. Within each stratum, teachers will be listed school by school and selected by simple random sampling using a table of random numbers. Head teachers will be selected by stratified purposive sampling: in each stratum, the researcher will choose head teachers of schools of different sizes and staffing levels so that the interviews capture a range of experiences. Classroom observation and document analysis will be carried out in the same 14 schools.</w:t>
+        <w:t xml:space="preserve">Teachers will be chosen by proportionate stratified random sampling. Stratifying makes sure that teachers in town, rural and remote schools are included in proportion to their numbers. This matters because conditions in the three settings are very different. In each stratum the teachers will be listed school by school, and a table of random numbers will be used to pick them. Head teachers will be chosen by stratified purposive sampling. In each stratum the researcher will pick head teachers from schools of different sizes and staffing levels so that the interviews cover a range of experiences. Lesson observation and document analysis will be done in these same 14 schools.</w:t>
       </w:r>
     </w:p>
     <w:p>
@@ -6886,7 +6886,7 @@
         <w:jc w:val="both"/>
       </w:pPr>
       <w:r>
-        <w:t xml:space="preserve">The teacher sample was calculated using Yamane’s (1967) formula at a 95% confidence level and a 5% margin of error:</w:t>
+        <w:t xml:space="preserve">Yamane’s (1967) formula was used to calculate the teacher sample, at a 95% confidence level and a 5% margin of error:</w:t>
       </w:r>
     </w:p>
     <w:p>
@@ -6923,7 +6923,7 @@
         <w:jc w:val="both"/>
       </w:pPr>
       <w:r>
-        <w:t xml:space="preserve">The 192 teachers will be distributed across the three strata in proportion to their size, as shown in Table 3.2. Fourteen head teachers, about 30% of the 46, will be selected; this falls within the 10% to 30% range that Mugenda and Mugenda (2003) consider adequate for descriptive studies.</w:t>
+        <w:t xml:space="preserve">The 192 teachers will be shared among the three strata in proportion to their size (Table 3.2). Fourteen head teachers will be selected. This is about 30% of the 46, which is within the 10% to 30% that Mugenda and Mugenda (2003) consider enough for a descriptive study.</w:t>
       </w:r>
     </w:p>
     <w:p>
@@ -8252,7 +8252,7 @@
         <w:jc w:val="both"/>
       </w:pPr>
       <w:r>
-        <w:t xml:space="preserve">In addition, 28 lessons will be observed, two in each of the 14 schools, and the schemes of work, lesson plans, learner portfolios and assessment records in those schools will be reviewed.</w:t>
+        <w:t xml:space="preserve">The researcher will also observe 28 lessons, two in each of the 14 schools, and review the schemes of work, lesson plans, learner portfolios and assessment records in those schools.</w:t>
       </w:r>
     </w:p>
     <w:p>
@@ -8271,7 +8271,7 @@
         <w:jc w:val="both"/>
       </w:pPr>
       <w:r>
-        <w:t xml:space="preserve">Four instruments will be used so that information from one source can be checked against the others.</w:t>
+        <w:t xml:space="preserve">Four instruments will be used, so that what comes from one source can be checked against the others.</w:t>
       </w:r>
     </w:p>
     <w:p>
@@ -8287,7 +8287,7 @@
         <w:t xml:space="preserve">Teacher questionnaire.</w:t>
       </w:r>
       <w:r>
-        <w:t xml:space="preserve"> The 192 sampled teachers will complete a structured questionnaire (Appendix III) with eight sections: background information, in-service training, attitude towards the CBC, pedagogical skills, competency-based assessment skills, implementation of the CBC, intervening factors and an open section for suggestions. Except for the background and open sections, items will be rated on a five-point Likert scale from 1 (strongly disagree) to 5 (strongly agree). The questionnaire will be in English, the teachers’ working language, and should take about 25 minutes to complete.</w:t>
+        <w:t xml:space="preserve"> The 192 sampled teachers will fill in a structured questionnaire (Appendix III). It has eight sections: background information, in-service training, attitude towards the CBC, pedagogical skills, competency-based assessment skills, implementation of the CBC, intervening factors, and a last open question for suggestions. Apart from the background and open sections, items use a five-point Likert scale from 1 (strongly disagree) to 5 (strongly agree). The questionnaire is in English, which teachers use at work, and takes about 25 minutes.</w:t>
       </w:r>
     </w:p>
     <w:p>
@@ -8303,7 +8303,7 @@
         <w:t xml:space="preserve">Interview guide for head teachers.</w:t>
       </w:r>
       <w:r>
-        <w:t xml:space="preserve"> A semi-structured guide (Appendix IV) will be used with the 14 head teachers. It covers how teachers were trained for the CBC, how they feel about it, their teaching and assessment practices, the support the school offers and the head teacher’s view of how well the CBC is being implemented. Each interview should last 30 to 45 minutes.</w:t>
+        <w:t xml:space="preserve"> The 14 head teachers will be interviewed using a semi-structured guide (Appendix IV). The questions ask how teachers were trained for the CBC, how they feel about it, how they teach and assess, what support the school gives, and how well the head teacher thinks the CBC is being implemented. Each interview should take 30 to 45 minutes.</w:t>
       </w:r>
     </w:p>
     <w:p>
@@ -8319,7 +8319,7 @@
         <w:t xml:space="preserve">Classroom observation checklist.</w:t>
       </w:r>
       <w:r>
-        <w:t xml:space="preserve"> The researcher will observe 28 lessons using a checklist (Appendix V) based on the CBC lesson structure. It records evidence of lesson planning, learner-centred methods, integration of core competencies, values and PCIs, use of resources, assessment practices and learner participation. Each item is rated as not observed, partly observed or fully observed.</w:t>
+        <w:t xml:space="preserve"> The researcher will use a checklist (Appendix V), based on the CBC lesson structure, to observe 28 lessons. It looks for evidence of lesson planning, learner-centred methods, core competencies, values and PCIs, use of resources, assessment and learner participation. Each item is marked as not observed, partly observed or fully observed.</w:t>
       </w:r>
     </w:p>
     <w:p>
@@ -8335,7 +8335,7 @@
         <w:t xml:space="preserve">Document analysis guide.</w:t>
       </w:r>
       <w:r>
-        <w:t xml:space="preserve"> The researcher will review schemes of work, lesson plans, learner portfolios, assessment records and training records (Appendix VI) to confirm what teachers report and what is seen in class.</w:t>
+        <w:t xml:space="preserve"> The researcher will go through schemes of work, lesson plans, learner portfolios, assessment records and training records (Appendix VI) to check what teachers report and what is seen in class.</w:t>
       </w:r>
     </w:p>
     <w:p>
@@ -9543,7 +9543,7 @@
         <w:jc w:val="both"/>
       </w:pPr>
       <w:r>
-        <w:t xml:space="preserve">The instruments will be piloted in public primary schools in Wajir South Sub-County, which borders Habaswein and has similar conditions but is not part of the main sample. The pilot will involve 19 teachers (about 10% of the teacher sample) and two head teachers, following Mugenda and Mugenda (2003), together with two lesson observations. It will help to identify unclear items, establish how long the questionnaire takes, test the practicality of the observation checklist and check the reliability of the scales. The instruments will be revised in light of the pilot results.</w:t>
+        <w:t xml:space="preserve">The instruments will be piloted in public primary schools in Wajir South Sub-County. It borders Habaswein and has similar conditions, but it is not part of the main sample. Following Mugenda and Mugenda (2003), the pilot will involve 19 teachers (about 10% of the teacher sample) and two head teachers, plus two lesson observations. The pilot will show which items are unclear, how long the questionnaire takes, whether the observation checklist is practical, and how reliable the scales are. The instruments will then be revised.</w:t>
       </w:r>
     </w:p>
     <w:p>
@@ -9562,7 +9562,7 @@
         <w:jc w:val="both"/>
       </w:pPr>
       <w:r>
-        <w:t xml:space="preserve">Validity is the extent to which an instrument measures what it is intended to measure (Creswell &amp; Creswell, 2023). To ensure content validity, every item will be mapped to an objective and to the indicators in Table 3.4. The university supervisors and two curriculum studies experts will rate the relevance of each item, and their ratings will be used to compute a Content Validity Index (CVI); a value of 0.80 or above will be accepted. The pilot will also confirm face validity by showing whether teachers understand the items as intended.</w:t>
+        <w:t xml:space="preserve">Validity is how far an instrument measures what it is supposed to measure (Creswell &amp; Creswell, 2023). For content validity, each item will be matched to an objective and to the indicators in Table 3.4. The university supervisors and two experts in curriculum studies will then rate how relevant each item is. A Content Validity Index (CVI) will be worked out from their ratings, and 0.80 or above will be accepted. The pilot will also check face validity, that is, whether teachers understand the items the way they are meant.</w:t>
       </w:r>
     </w:p>
     <w:p>
@@ -9581,7 +9581,7 @@
         <w:jc w:val="both"/>
       </w:pPr>
       <w:r>
-        <w:t xml:space="preserve">Reliability refers to how consistently an instrument produces the same results under similar conditions (Creswell &amp; Creswell, 2023). Cronbach’s alpha will be computed for each Likert scale using the pilot data, and a coefficient of 0.70 or higher will be accepted; items that lower a scale below this level will be revised or removed. For the observation checklist, the researcher and a trained research assistant will rate the two pilot lessons independently and compare their scores. The trustworthiness of qualitative data will be supported through triangulation, detailed field notes, audio recording of interviews where consent is given and an audit trail of analytical decisions (Braun &amp; Clarke, 2022).</w:t>
+        <w:t xml:space="preserve">Reliability is how consistently an instrument gives the same results under similar conditions (Creswell &amp; Creswell, 2023). Cronbach’s alpha will be calculated for each Likert scale from the pilot data. A value of 0.70 or more will be accepted, and any item that pulls a scale below this will be reworded or dropped. For the observation checklist, the researcher and a trained research assistant will each rate the two pilot lessons on their own and then compare scores. For the qualitative data, trustworthiness will come from triangulation, detailed field notes, audio recordings of interviews (where the respondent agrees) and a written record of analysis decisions (Braun &amp; Clarke, 2022).</w:t>
       </w:r>
     </w:p>
     <w:p>
@@ -9600,7 +9600,7 @@
         <w:jc w:val="both"/>
       </w:pPr>
       <w:r>
-        <w:t xml:space="preserve">After the proposal is approved, the researcher will obtain an introduction letter from Mount Kenya University, ethical clearance from the university’s ethics review committee and a research permit from the National Commission for Science, Technology and Innovation (NACOSTI). Permission will then be sought from the Wajir County Director of Education, the TSC Sub-County Director, the Sub-County Director of Education in Habaswein and the local administration, and head teachers of sampled schools will be contacted to agree on visit dates.</w:t>
+        <w:t xml:space="preserve">Once the proposal is approved, the researcher will get an introduction letter from Mount Kenya University, ethical clearance from the university’s ethics review committee, and a research permit from the National Commission for Science, Technology and Innovation (NACOSTI). The researcher will then ask for permission from the Wajir County Director of Education, the TSC Sub-County Director, the Sub-County Director of Education in Habaswein and the local administration. Head teachers of the sampled schools will be contacted to agree on dates for the visits.</w:t>
       </w:r>
     </w:p>
     <w:p>
@@ -9609,7 +9609,7 @@
         <w:jc w:val="both"/>
       </w:pPr>
       <w:r>
-        <w:t xml:space="preserve">Three research assistants familiar with the area will be recruited and trained for two days on the instruments, sampling procedure and research ethics. Questionnaires will be delivered in person and, where possible, collected the same day to maximise the response rate. The researcher will personally conduct all head teacher interviews and lesson observations, with a research assistant co-observing some lessons to check consistency. Documents will be reviewed during the same visits. Data will be collected in March and April 2027, and trips to remote schools will be planned with the advice of local security officers.</w:t>
+        <w:t xml:space="preserve">Three research assistants who know the area will be hired and given two days of training on the instruments, the sampling procedure and research ethics. Questionnaires will be taken to schools in person and, where possible, picked up the same day so that more are returned. The researcher will carry out all the head teacher interviews and lesson observations, and a research assistant will sit in on some lessons to check that ratings are consistent. Documents will be reviewed on the same visits. Data collection will run through March and April 2027, and visits to remote schools will be planned with advice from local security officers.</w:t>
       </w:r>
     </w:p>
     <w:p>
@@ -9628,7 +9628,7 @@
         <w:jc w:val="both"/>
       </w:pPr>
       <w:r>
-        <w:t xml:space="preserve">Completed questionnaires will be checked, coded and entered into the Statistical Package for the Social Sciences (SPSS) version 29. Descriptive statistics, namely frequencies, percentages, means and standard deviations, will be used to describe each dimension of teacher preparedness and the level of implementation. Mean scores will be interpreted on the five-point scale as follows: 4.0 and above, high; 3.0 to 3.9, moderate; below 3.0, low.</w:t>
+        <w:t xml:space="preserve">Completed questionnaires will be checked for completeness, coded and entered into the Statistical Package for the Social Sciences (SPSS) version 29. Frequencies, percentages, means and standard deviations will be used to describe each dimension of preparedness and the level of implementation. On the five-point scale, a mean of 4.0 or more will be read as high, 3.0 to 3.9 as moderate and below 3.0 as low.</w:t>
       </w:r>
     </w:p>
     <w:p>
@@ -9638,7 +9638,7 @@
         <w:jc w:val="both"/>
       </w:pPr>
       <w:r>
-        <w:t xml:space="preserve">To test each null hypothesis, Pearson’s product-moment correlation will first be used to establish the strength and direction of the relationship between the dimension of preparedness and implementation, and simple linear regression will then be used to determine its influence:</w:t>
+        <w:t xml:space="preserve">For each null hypothesis, Pearson’s product-moment correlation will first show how strong the relationship is between that dimension of preparedness and implementation, and in which direction. Simple linear regression will then be used to estimate its influence:</w:t>
       </w:r>
     </w:p>
     <w:p>
@@ -9657,7 +9657,7 @@
         <w:jc w:val="both"/>
       </w:pPr>
       <w:r>
-        <w:t xml:space="preserve">where Y is implementation of the CBC, β₀ is the constant, β₁ is the regression coefficient, Xᵢ is the composite score for the dimension of preparedness being tested (i = 1, 2, 3, 4) and ε is the error term. A multiple regression model will then be fitted to establish the combined and relative influence of the four dimensions:</w:t>
+        <w:t xml:space="preserve">Here Y is implementation of the CBC, β₀ is the constant, β₁ is the regression coefficient, Xᵢ is the composite score for the dimension being tested (i = 1, 2, 3, 4) and ε is the error term. A multiple regression model will then show the combined influence of the four dimensions and how much each one contributes:</w:t>
       </w:r>
     </w:p>
     <w:p>
@@ -9675,7 +9675,7 @@
         <w:jc w:val="both"/>
       </w:pPr>
       <w:r>
-        <w:t xml:space="preserve">where X₁ is in-service training, X₂ is attitude towards the CBC, X₃ is pedagogical skills and X₄ is competency-based assessment skills. The assumptions of normality, linearity, homoscedasticity and absence of multicollinearity will be checked before the regressions are run. Each null hypothesis will be rejected where p &lt; 0.05.</w:t>
+        <w:t xml:space="preserve">In this model, X₁ is in-service training, X₂ is attitude towards the CBC, X₃ is pedagogical skills and X₄ is competency-based assessment skills. Before running the regressions, the researcher will check the assumptions of normality, linearity, homoscedasticity and no multicollinearity. A null hypothesis will be rejected if p &lt; 0.05.</w:t>
       </w:r>
     </w:p>
     <w:p>
@@ -9684,7 +9684,7 @@
         <w:jc w:val="both"/>
       </w:pPr>
       <w:r>
-        <w:t xml:space="preserve">Interview recordings, observation notes and document reviews will be transcribed and analysed thematically using Braun and Clarke’s (2022) six phases: familiarisation, coding, generating themes, reviewing themes, defining and naming themes, and writing up. Observation checklist ratings will be summarised using frequencies and percentages. Quantitative results will be presented in tables and charts, and qualitative results as themes supported by short quotations. The two sets of results will then be compared and discussed together. Table 3.5 summarises the analysis plan.</w:t>
+        <w:t xml:space="preserve">Interview recordings, observation notes and document reviews will be transcribed and analysed thematically, following the six phases described by Braun and Clarke (2022). These are getting familiar with the data, coding, generating themes, reviewing them, defining and naming them, and writing up. Ratings from the observation checklist will be summarised as frequencies and percentages. Quantitative results will be shown in tables and charts, and qualitative results as themes with short quotations from respondents. The two sets of results will then be compared and discussed side by side. The analysis plan is summarised in Table 3.5.</w:t>
       </w:r>
     </w:p>
     <w:p>
@@ -10344,7 +10344,7 @@
         <w:jc w:val="both"/>
       </w:pPr>
       <w:r>
-        <w:t xml:space="preserve">The study will observe the ethical standards expected in research involving people. No data will be collected before approval from the Mount Kenya University ethics review committee and a NACOSTI permit have been obtained. Participation will be voluntary. Before signing the consent form (Appendix II), each respondent will be told the purpose of the study, what participation involves and any possible risks, and will be free to skip any question or withdraw at any time without penalty. Names will not appear on questionnaires, and schools will be identified by codes. Respondents will be assured that the study is independent of the TSC and that nothing they say will be used for appraisal or discipline. Lesson observations will be arranged in advance with the teacher’s consent, and interviews will be recorded only with permission. Electronic data will be stored on a password-protected computer and paper forms in a locked cabinet, and raw data will be destroyed five years after the study. The researcher will respect local customs, for example by planning visits around prayer times and working with community leaders. All sources will be acknowledged, and the findings will be shared with the Sub-County Director of Education and participating schools.</w:t>
+        <w:t xml:space="preserve">No data will be collected until the Mount Kenya University ethics review committee has approved the study and a NACOSTI permit has been issued. Taking part will be voluntary. Before signing the consent form (Appendix II), each respondent will be told what the study is about, what taking part involves and any possible risks. They may skip any question or pull out at any time without penalty. Names will not be written on questionnaires, and schools will be given codes. Respondents will be told clearly that the study is independent of the TSC and that nothing they say will be used for appraisal or discipline. Lesson observations will be agreed with the teacher beforehand, and interviews will only be recorded with permission. Electronic data will be kept on a password-protected computer and paper forms in a locked cabinet, and the raw data will be destroyed five years after the study. The researcher will respect local customs, for example by planning visits around prayer times and working through community leaders. All sources will be acknowledged, and the findings will be shared with the Sub-County Director of Education and the schools that took part.</w:t>
       </w:r>
     </w:p>
     <w:p>

</xml_diff>